<commit_message>
Updated contribution agreement details
</commit_message>
<xml_diff>
--- a/Low Battery Team Contribution Statement.docx
+++ b/Low Battery Team Contribution Statement.docx
@@ -63,7 +63,75 @@
         <w:t>Conducted dataset inspection and quality assessment.</w:t>
       </w:r>
     </w:p>
-    <w:p xmlns:wp14="http://schemas.microsoft.com/office/word/2010/wordml" wp14:paraId="07869E55" wp14:textId="510B43F7">
+    <w:p xmlns:wp14="http://schemas.microsoft.com/office/word/2010/wordml" wp14:paraId="405BC35A" wp14:textId="2A97D489">
+      <w:pPr>
+        <w:pStyle w:val="Normal"/>
+      </w:pPr>
+      <w:r>
+        <w:rPr/>
+        <w:t>Investigated data quality issues and documented findings.</w:t>
+      </w:r>
+    </w:p>
+    <w:p xmlns:wp14="http://schemas.microsoft.com/office/word/2010/wordml" wp14:paraId="0558AE22" wp14:textId="3967527F">
+      <w:pPr>
+        <w:pStyle w:val="Normal"/>
+      </w:pPr>
+      <w:r>
+        <w:rPr/>
+        <w:t>Implemented data cleaning and transformation procedures.</w:t>
+      </w:r>
+    </w:p>
+    <w:p xmlns:wp14="http://schemas.microsoft.com/office/word/2010/wordml" wp14:paraId="48F192EB" wp14:textId="68F87BA8">
+      <w:pPr>
+        <w:pStyle w:val="Normal"/>
+      </w:pPr>
+      <w:r>
+        <w:rPr/>
+        <w:t>Contributed to exploratory data analysis documentation and interpretation.</w:t>
+      </w:r>
+    </w:p>
+    <w:p xmlns:wp14="http://schemas.microsoft.com/office/word/2010/wordml" wp14:paraId="454DB953" wp14:textId="6CF061F0">
+      <w:pPr>
+        <w:pStyle w:val="Normal"/>
+      </w:pPr>
+      <w:r>
+        <w:rPr/>
+        <w:t>Developed the data pipeline diagram.</w:t>
+      </w:r>
+    </w:p>
+    <w:p xmlns:wp14="http://schemas.microsoft.com/office/word/2010/wordml" wp14:paraId="0CB5BD47" wp14:textId="1CABDD12">
+      <w:pPr>
+        <w:pStyle w:val="Normal"/>
+      </w:pPr>
+    </w:p>
+    <w:p xmlns:wp14="http://schemas.microsoft.com/office/word/2010/wordml" wp14:paraId="6E39D33A" wp14:textId="36FE672D">
+      <w:pPr>
+        <w:pStyle w:val="Normal"/>
+      </w:pPr>
+      <w:r>
+        <w:rPr/>
+        <w:t>Huyin Song Contributions</w:t>
+      </w:r>
+    </w:p>
+    <w:p xmlns:wp14="http://schemas.microsoft.com/office/word/2010/wordml" wp14:paraId="74F16716" wp14:textId="437744D9">
+      <w:pPr>
+        <w:pStyle w:val="Normal"/>
+      </w:pPr>
+      <w:r>
+        <w:rPr/>
+        <w:t>Established and maintained the project repository structure.</w:t>
+      </w:r>
+    </w:p>
+    <w:p xmlns:wp14="http://schemas.microsoft.com/office/word/2010/wordml" wp14:paraId="11A5C375" wp14:textId="236F68A0">
+      <w:pPr>
+        <w:pStyle w:val="Normal"/>
+      </w:pPr>
+      <w:r>
+        <w:rPr/>
+        <w:t>Implemented dataset loading and preprocessing procedures.</w:t>
+      </w:r>
+    </w:p>
+    <w:p>
       <w:pPr>
         <w:pStyle w:val="Normal"/>
       </w:pPr>
@@ -72,90 +140,13 @@
         <w:t>Examined dataset structure, data types, missing values, and duplicate records.</w:t>
       </w:r>
     </w:p>
-    <w:p xmlns:wp14="http://schemas.microsoft.com/office/word/2010/wordml" wp14:paraId="405BC35A" wp14:textId="2A97D489">
-      <w:pPr>
-        <w:pStyle w:val="Normal"/>
-      </w:pPr>
-      <w:r>
-        <w:rPr/>
-        <w:t>Investigated data quality issues and documented findings.</w:t>
-      </w:r>
-    </w:p>
-    <w:p xmlns:wp14="http://schemas.microsoft.com/office/word/2010/wordml" wp14:paraId="0558AE22" wp14:textId="3967527F">
-      <w:pPr>
-        <w:pStyle w:val="Normal"/>
-      </w:pPr>
-      <w:r>
-        <w:rPr/>
-        <w:t>Implemented data cleaning and transformation procedures.</w:t>
-      </w:r>
-    </w:p>
-    <w:p xmlns:wp14="http://schemas.microsoft.com/office/word/2010/wordml" wp14:paraId="28FB1A66" wp14:textId="5F5CCBC3">
+    <w:p>
       <w:pPr>
         <w:pStyle w:val="Normal"/>
       </w:pPr>
       <w:r>
         <w:rPr/>
         <w:t>Removed irrelevant and target-leakage features from the dataset.</w:t>
-      </w:r>
-    </w:p>
-    <w:p xmlns:wp14="http://schemas.microsoft.com/office/word/2010/wordml" wp14:paraId="48F192EB" wp14:textId="68F87BA8">
-      <w:pPr>
-        <w:pStyle w:val="Normal"/>
-      </w:pPr>
-      <w:r>
-        <w:rPr/>
-        <w:t>Contributed to exploratory data analysis documentation and interpretation.</w:t>
-      </w:r>
-    </w:p>
-    <w:p xmlns:wp14="http://schemas.microsoft.com/office/word/2010/wordml" wp14:paraId="454DB953" wp14:textId="6CF061F0">
-      <w:pPr>
-        <w:pStyle w:val="Normal"/>
-      </w:pPr>
-      <w:r>
-        <w:rPr/>
-        <w:t>Developed the data pipeline diagram.</w:t>
-      </w:r>
-    </w:p>
-    <w:p xmlns:wp14="http://schemas.microsoft.com/office/word/2010/wordml" wp14:paraId="5D26F4E5" wp14:textId="72098004">
-      <w:pPr>
-        <w:pStyle w:val="Normal"/>
-      </w:pPr>
-      <w:r>
-        <w:rPr/>
-        <w:t>Assisted with report preparation and review.</w:t>
-      </w:r>
-    </w:p>
-    <w:p xmlns:wp14="http://schemas.microsoft.com/office/word/2010/wordml" wp14:paraId="0CB5BD47" wp14:textId="1CABDD12">
-      <w:pPr>
-        <w:pStyle w:val="Normal"/>
-      </w:pPr>
-    </w:p>
-    <w:p xmlns:wp14="http://schemas.microsoft.com/office/word/2010/wordml" wp14:paraId="6E39D33A" wp14:textId="36FE672D">
-      <w:pPr>
-        <w:pStyle w:val="Normal"/>
-      </w:pPr>
-      <w:r>
-        <w:rPr/>
-        <w:t>Huyin Song Contributions</w:t>
-      </w:r>
-    </w:p>
-    <w:p xmlns:wp14="http://schemas.microsoft.com/office/word/2010/wordml" wp14:paraId="74F16716" wp14:textId="437744D9">
-      <w:pPr>
-        <w:pStyle w:val="Normal"/>
-      </w:pPr>
-      <w:r>
-        <w:rPr/>
-        <w:t>Established and maintained the project repository structure.</w:t>
-      </w:r>
-    </w:p>
-    <w:p xmlns:wp14="http://schemas.microsoft.com/office/word/2010/wordml" wp14:paraId="11A5C375" wp14:textId="236F68A0">
-      <w:pPr>
-        <w:pStyle w:val="Normal"/>
-      </w:pPr>
-      <w:r>
-        <w:rPr/>
-        <w:t>Implemented dataset loading and preprocessing procedures.</w:t>
       </w:r>
     </w:p>
     <w:p xmlns:wp14="http://schemas.microsoft.com/office/word/2010/wordml" wp14:paraId="6E59FDE0" wp14:textId="336B6B90">

</xml_diff>

<commit_message>
Contributions statement update, misleading
I forgot to update Erin's contributions page, it mislead her towards a lower contributions percentage
</commit_message>
<xml_diff>
--- a/Low Battery Team Contribution Statement.docx
+++ b/Low Battery Team Contribution Statement.docx
@@ -254,7 +254,49 @@
                 <w:sz w:val="28"/>
                 <w:szCs w:val="28"/>
               </w:rPr>
-              <w:t>20 (68.97%)*</w:t>
+              <w:t>2</w:t>
+            </w:r>
+            <w:r>
+              <w:rPr>
+                <w:rFonts w:ascii="Bahnschrift SemiLight" w:hAnsi="Bahnschrift SemiLight"/>
+                <w:sz w:val="28"/>
+                <w:szCs w:val="28"/>
+              </w:rPr>
+              <w:t>1</w:t>
+            </w:r>
+          </w:p>
+          <w:p>
+            <w:pPr>
+              <w:jc w:val="center"/>
+              <w:rPr>
+                <w:rFonts w:ascii="Bahnschrift SemiLight" w:hAnsi="Bahnschrift SemiLight"/>
+                <w:sz w:val="28"/>
+                <w:szCs w:val="28"/>
+              </w:rPr>
+            </w:pPr>
+            <w:r>
+              <w:rPr>
+                <w:rFonts w:ascii="Bahnschrift SemiLight" w:hAnsi="Bahnschrift SemiLight"/>
+                <w:sz w:val="28"/>
+                <w:szCs w:val="28"/>
+              </w:rPr>
+              <w:t>(</w:t>
+            </w:r>
+            <w:r>
+              <w:rPr>
+                <w:rFonts w:ascii="Bahnschrift SemiLight" w:hAnsi="Bahnschrift SemiLight"/>
+                <w:sz w:val="28"/>
+                <w:szCs w:val="28"/>
+              </w:rPr>
+              <w:t>70.00</w:t>
+            </w:r>
+            <w:r>
+              <w:rPr>
+                <w:rFonts w:ascii="Bahnschrift SemiLight" w:hAnsi="Bahnschrift SemiLight"/>
+                <w:sz w:val="28"/>
+                <w:szCs w:val="28"/>
+              </w:rPr>
+              <w:t>%)*</w:t>
             </w:r>
           </w:p>
         </w:tc>
@@ -277,7 +319,41 @@
                 <w:sz w:val="28"/>
                 <w:szCs w:val="28"/>
               </w:rPr>
-              <w:t>9 (31.03%)*</w:t>
+              <w:t>9</w:t>
+            </w:r>
+          </w:p>
+          <w:p>
+            <w:pPr>
+              <w:jc w:val="center"/>
+              <w:rPr>
+                <w:rFonts w:ascii="Bahnschrift SemiLight" w:hAnsi="Bahnschrift SemiLight"/>
+                <w:sz w:val="28"/>
+                <w:szCs w:val="28"/>
+              </w:rPr>
+            </w:pPr>
+            <w:r>
+              <w:rPr>
+                <w:rFonts w:ascii="Bahnschrift SemiLight" w:hAnsi="Bahnschrift SemiLight"/>
+                <w:sz w:val="28"/>
+                <w:szCs w:val="28"/>
+              </w:rPr>
+              <w:t>(3</w:t>
+            </w:r>
+            <w:r>
+              <w:rPr>
+                <w:rFonts w:ascii="Bahnschrift SemiLight" w:hAnsi="Bahnschrift SemiLight"/>
+                <w:sz w:val="28"/>
+                <w:szCs w:val="28"/>
+              </w:rPr>
+              <w:t>0.00</w:t>
+            </w:r>
+            <w:r>
+              <w:rPr>
+                <w:rFonts w:ascii="Bahnschrift SemiLight" w:hAnsi="Bahnschrift SemiLight"/>
+                <w:sz w:val="28"/>
+                <w:szCs w:val="28"/>
+              </w:rPr>
+              <w:t>%)*</w:t>
             </w:r>
           </w:p>
         </w:tc>
@@ -325,25 +401,49 @@
                 <w:sz w:val="28"/>
                 <w:szCs w:val="28"/>
               </w:rPr>
-              <w:t>36,242*</w:t>
-            </w:r>
-          </w:p>
-          <w:p>
-            <w:pPr>
-              <w:jc w:val="center"/>
-              <w:rPr>
-                <w:rFonts w:ascii="Bahnschrift SemiLight" w:hAnsi="Bahnschrift SemiLight"/>
-                <w:sz w:val="28"/>
-                <w:szCs w:val="28"/>
-              </w:rPr>
-            </w:pPr>
-            <w:r>
-              <w:rPr>
-                <w:rFonts w:ascii="Bahnschrift SemiLight" w:hAnsi="Bahnschrift SemiLight"/>
-                <w:sz w:val="28"/>
-                <w:szCs w:val="28"/>
-              </w:rPr>
-              <w:t>99.94%</w:t>
+              <w:t>36,</w:t>
+            </w:r>
+            <w:r>
+              <w:rPr>
+                <w:rFonts w:ascii="Bahnschrift SemiLight" w:hAnsi="Bahnschrift SemiLight"/>
+                <w:sz w:val="28"/>
+                <w:szCs w:val="28"/>
+              </w:rPr>
+              <w:t>401</w:t>
+            </w:r>
+            <w:r>
+              <w:rPr>
+                <w:rFonts w:ascii="Bahnschrift SemiLight" w:hAnsi="Bahnschrift SemiLight"/>
+                <w:sz w:val="28"/>
+                <w:szCs w:val="28"/>
+              </w:rPr>
+              <w:t>*</w:t>
+            </w:r>
+          </w:p>
+          <w:p>
+            <w:pPr>
+              <w:jc w:val="center"/>
+              <w:rPr>
+                <w:rFonts w:ascii="Bahnschrift SemiLight" w:hAnsi="Bahnschrift SemiLight"/>
+                <w:sz w:val="28"/>
+                <w:szCs w:val="28"/>
+              </w:rPr>
+            </w:pPr>
+            <w:r>
+              <w:rPr>
+                <w:rFonts w:ascii="Bahnschrift SemiLight" w:hAnsi="Bahnschrift SemiLight"/>
+                <w:sz w:val="28"/>
+                <w:szCs w:val="28"/>
+              </w:rPr>
+              <w:t>99.74</w:t>
+            </w:r>
+            <w:r>
+              <w:rPr>
+                <w:rFonts w:ascii="Bahnschrift SemiLight" w:hAnsi="Bahnschrift SemiLight"/>
+                <w:sz w:val="28"/>
+                <w:szCs w:val="28"/>
+              </w:rPr>
+              <w:t>%</w:t>
             </w:r>
           </w:p>
         </w:tc>
@@ -366,25 +466,41 @@
                 <w:sz w:val="28"/>
                 <w:szCs w:val="28"/>
               </w:rPr>
-              <w:t>22*</w:t>
-            </w:r>
-          </w:p>
-          <w:p>
-            <w:pPr>
-              <w:jc w:val="center"/>
-              <w:rPr>
-                <w:rFonts w:ascii="Bahnschrift SemiLight" w:hAnsi="Bahnschrift SemiLight"/>
-                <w:sz w:val="28"/>
-                <w:szCs w:val="28"/>
-              </w:rPr>
-            </w:pPr>
-            <w:r>
-              <w:rPr>
-                <w:rFonts w:ascii="Bahnschrift SemiLight" w:hAnsi="Bahnschrift SemiLight"/>
-                <w:sz w:val="28"/>
-                <w:szCs w:val="28"/>
-              </w:rPr>
-              <w:t>0.06%</w:t>
+              <w:t>96</w:t>
+            </w:r>
+            <w:r>
+              <w:rPr>
+                <w:rFonts w:ascii="Bahnschrift SemiLight" w:hAnsi="Bahnschrift SemiLight"/>
+                <w:sz w:val="28"/>
+                <w:szCs w:val="28"/>
+              </w:rPr>
+              <w:t>*</w:t>
+            </w:r>
+          </w:p>
+          <w:p>
+            <w:pPr>
+              <w:jc w:val="center"/>
+              <w:rPr>
+                <w:rFonts w:ascii="Bahnschrift SemiLight" w:hAnsi="Bahnschrift SemiLight"/>
+                <w:sz w:val="28"/>
+                <w:szCs w:val="28"/>
+              </w:rPr>
+            </w:pPr>
+            <w:r>
+              <w:rPr>
+                <w:rFonts w:ascii="Bahnschrift SemiLight" w:hAnsi="Bahnschrift SemiLight"/>
+                <w:sz w:val="28"/>
+                <w:szCs w:val="28"/>
+              </w:rPr>
+              <w:t>0.26</w:t>
+            </w:r>
+            <w:r>
+              <w:rPr>
+                <w:rFonts w:ascii="Bahnschrift SemiLight" w:hAnsi="Bahnschrift SemiLight"/>
+                <w:sz w:val="28"/>
+                <w:szCs w:val="28"/>
+              </w:rPr>
+              <w:t>%</w:t>
             </w:r>
           </w:p>
         </w:tc>
@@ -432,25 +548,49 @@
                 <w:sz w:val="28"/>
                 <w:szCs w:val="28"/>
               </w:rPr>
-              <w:t>24,578*</w:t>
-            </w:r>
-          </w:p>
-          <w:p>
-            <w:pPr>
-              <w:jc w:val="center"/>
-              <w:rPr>
-                <w:rFonts w:ascii="Bahnschrift SemiLight" w:hAnsi="Bahnschrift SemiLight"/>
-                <w:sz w:val="28"/>
-                <w:szCs w:val="28"/>
-              </w:rPr>
-            </w:pPr>
-            <w:r>
-              <w:rPr>
-                <w:rFonts w:ascii="Bahnschrift SemiLight" w:hAnsi="Bahnschrift SemiLight"/>
-                <w:sz w:val="28"/>
-                <w:szCs w:val="28"/>
-              </w:rPr>
-              <w:t>99.88%</w:t>
+              <w:t>24,5</w:t>
+            </w:r>
+            <w:r>
+              <w:rPr>
+                <w:rFonts w:ascii="Bahnschrift SemiLight" w:hAnsi="Bahnschrift SemiLight"/>
+                <w:sz w:val="28"/>
+                <w:szCs w:val="28"/>
+              </w:rPr>
+              <w:t>80</w:t>
+            </w:r>
+            <w:r>
+              <w:rPr>
+                <w:rFonts w:ascii="Bahnschrift SemiLight" w:hAnsi="Bahnschrift SemiLight"/>
+                <w:sz w:val="28"/>
+                <w:szCs w:val="28"/>
+              </w:rPr>
+              <w:t>*</w:t>
+            </w:r>
+          </w:p>
+          <w:p>
+            <w:pPr>
+              <w:jc w:val="center"/>
+              <w:rPr>
+                <w:rFonts w:ascii="Bahnschrift SemiLight" w:hAnsi="Bahnschrift SemiLight"/>
+                <w:sz w:val="28"/>
+                <w:szCs w:val="28"/>
+              </w:rPr>
+            </w:pPr>
+            <w:r>
+              <w:rPr>
+                <w:rFonts w:ascii="Bahnschrift SemiLight" w:hAnsi="Bahnschrift SemiLight"/>
+                <w:sz w:val="28"/>
+                <w:szCs w:val="28"/>
+              </w:rPr>
+              <w:t>99.42</w:t>
+            </w:r>
+            <w:r>
+              <w:rPr>
+                <w:rFonts w:ascii="Bahnschrift SemiLight" w:hAnsi="Bahnschrift SemiLight"/>
+                <w:sz w:val="28"/>
+                <w:szCs w:val="28"/>
+              </w:rPr>
+              <w:t>%</w:t>
             </w:r>
           </w:p>
         </w:tc>
@@ -473,25 +613,41 @@
                 <w:sz w:val="28"/>
                 <w:szCs w:val="28"/>
               </w:rPr>
-              <w:t>30*</w:t>
-            </w:r>
-          </w:p>
-          <w:p>
-            <w:pPr>
-              <w:jc w:val="center"/>
-              <w:rPr>
-                <w:rFonts w:ascii="Bahnschrift SemiLight" w:hAnsi="Bahnschrift SemiLight"/>
-                <w:sz w:val="28"/>
-                <w:szCs w:val="28"/>
-              </w:rPr>
-            </w:pPr>
-            <w:r>
-              <w:rPr>
-                <w:rFonts w:ascii="Bahnschrift SemiLight" w:hAnsi="Bahnschrift SemiLight"/>
-                <w:sz w:val="28"/>
-                <w:szCs w:val="28"/>
-              </w:rPr>
-              <w:t>0.12%</w:t>
+              <w:t>144</w:t>
+            </w:r>
+            <w:r>
+              <w:rPr>
+                <w:rFonts w:ascii="Bahnschrift SemiLight" w:hAnsi="Bahnschrift SemiLight"/>
+                <w:sz w:val="28"/>
+                <w:szCs w:val="28"/>
+              </w:rPr>
+              <w:t>*</w:t>
+            </w:r>
+          </w:p>
+          <w:p>
+            <w:pPr>
+              <w:jc w:val="center"/>
+              <w:rPr>
+                <w:rFonts w:ascii="Bahnschrift SemiLight" w:hAnsi="Bahnschrift SemiLight"/>
+                <w:sz w:val="28"/>
+                <w:szCs w:val="28"/>
+              </w:rPr>
+            </w:pPr>
+            <w:r>
+              <w:rPr>
+                <w:rFonts w:ascii="Bahnschrift SemiLight" w:hAnsi="Bahnschrift SemiLight"/>
+                <w:sz w:val="28"/>
+                <w:szCs w:val="28"/>
+              </w:rPr>
+              <w:t>0.58</w:t>
+            </w:r>
+            <w:r>
+              <w:rPr>
+                <w:rFonts w:ascii="Bahnschrift SemiLight" w:hAnsi="Bahnschrift SemiLight"/>
+                <w:sz w:val="28"/>
+                <w:szCs w:val="28"/>
+              </w:rPr>
+              <w:t>%</w:t>
             </w:r>
           </w:p>
         </w:tc>
@@ -610,7 +766,23 @@
                 <w:sz w:val="28"/>
                 <w:szCs w:val="28"/>
               </w:rPr>
-              <w:t>2751 words</w:t>
+              <w:t>2</w:t>
+            </w:r>
+            <w:r>
+              <w:rPr>
+                <w:rFonts w:ascii="Bahnschrift SemiLight" w:hAnsi="Bahnschrift SemiLight"/>
+                <w:sz w:val="28"/>
+                <w:szCs w:val="28"/>
+              </w:rPr>
+              <w:t>999</w:t>
+            </w:r>
+            <w:r>
+              <w:rPr>
+                <w:rFonts w:ascii="Bahnschrift SemiLight" w:hAnsi="Bahnschrift SemiLight"/>
+                <w:sz w:val="28"/>
+                <w:szCs w:val="28"/>
+              </w:rPr>
+              <w:t xml:space="preserve"> words</w:t>
             </w:r>
           </w:p>
           <w:p>
@@ -717,7 +889,41 @@
                 <w:sz w:val="28"/>
                 <w:szCs w:val="28"/>
               </w:rPr>
-              <w:t>82 words</w:t>
+              <w:t>8</w:t>
+            </w:r>
+            <w:r>
+              <w:rPr>
+                <w:rFonts w:ascii="Bahnschrift SemiLight" w:hAnsi="Bahnschrift SemiLight"/>
+                <w:sz w:val="28"/>
+                <w:szCs w:val="28"/>
+              </w:rPr>
+              <w:t>4</w:t>
+            </w:r>
+            <w:r>
+              <w:rPr>
+                <w:rFonts w:ascii="Bahnschrift SemiLight" w:hAnsi="Bahnschrift SemiLight"/>
+                <w:sz w:val="28"/>
+                <w:szCs w:val="28"/>
+              </w:rPr>
+              <w:t xml:space="preserve"> words</w:t>
+            </w:r>
+          </w:p>
+          <w:p>
+            <w:pPr>
+              <w:jc w:val="center"/>
+              <w:rPr>
+                <w:rFonts w:ascii="Bahnschrift SemiLight" w:hAnsi="Bahnschrift SemiLight"/>
+                <w:sz w:val="28"/>
+                <w:szCs w:val="28"/>
+              </w:rPr>
+            </w:pPr>
+            <w:r>
+              <w:rPr>
+                <w:rFonts w:ascii="Bahnschrift SemiLight" w:hAnsi="Bahnschrift SemiLight"/>
+                <w:sz w:val="28"/>
+                <w:szCs w:val="28"/>
+              </w:rPr>
+              <w:t>35.74%</w:t>
             </w:r>
           </w:p>
         </w:tc>
@@ -740,7 +946,25 @@
                 <w:sz w:val="28"/>
                 <w:szCs w:val="28"/>
               </w:rPr>
-              <w:t>0</w:t>
+              <w:t>151 words</w:t>
+            </w:r>
+          </w:p>
+          <w:p>
+            <w:pPr>
+              <w:jc w:val="center"/>
+              <w:rPr>
+                <w:rFonts w:ascii="Bahnschrift SemiLight" w:hAnsi="Bahnschrift SemiLight"/>
+                <w:sz w:val="28"/>
+                <w:szCs w:val="28"/>
+              </w:rPr>
+            </w:pPr>
+            <w:r>
+              <w:rPr>
+                <w:rFonts w:ascii="Bahnschrift SemiLight" w:hAnsi="Bahnschrift SemiLight"/>
+                <w:sz w:val="28"/>
+                <w:szCs w:val="28"/>
+              </w:rPr>
+              <w:t>64.26%</w:t>
             </w:r>
           </w:p>
         </w:tc>
@@ -845,7 +1069,31 @@
           <w:sz w:val="28"/>
           <w:szCs w:val="28"/>
         </w:rPr>
-        <w:t>* Taken at 30/08/2026 10:13pm through GitHub Insights</w:t>
+        <w:t xml:space="preserve">* Taken at 30/08/2026 </w:t>
+      </w:r>
+      <w:r>
+        <w:rPr>
+          <w:rFonts w:ascii="Bahnschrift SemiLight" w:hAnsi="Bahnschrift SemiLight"/>
+          <w:sz w:val="28"/>
+          <w:szCs w:val="28"/>
+        </w:rPr>
+        <w:t>11:4</w:t>
+      </w:r>
+      <w:r>
+        <w:rPr>
+          <w:rFonts w:ascii="Bahnschrift SemiLight" w:hAnsi="Bahnschrift SemiLight"/>
+          <w:sz w:val="28"/>
+          <w:szCs w:val="28"/>
+        </w:rPr>
+        <w:t>9</w:t>
+      </w:r>
+      <w:r>
+        <w:rPr>
+          <w:rFonts w:ascii="Bahnschrift SemiLight" w:hAnsi="Bahnschrift SemiLight"/>
+          <w:sz w:val="28"/>
+          <w:szCs w:val="28"/>
+        </w:rPr>
+        <w:t>pm through GitHub Insights</w:t>
       </w:r>
     </w:p>
     <w:p/>

</xml_diff>